<commit_message>
fix(zh-cn): preserve CJK fonts in DOCX output
</commit_message>
<xml_diff>
--- a/5.0/docs_zh-cn/OWASP_Application_Security_Verification_Standard_5.0.0_zh-cn.docx
+++ b/5.0/docs_zh-cn/OWASP_Application_Security_Verification_Standard_5.0.0_zh-cn.docx
@@ -49936,14 +49936,14 @@
 </file>
 
 <file path=word/styles.xml><?xml version="1.0" encoding="utf-8"?>
-<w:styles xmlns:mc="http://schemas.openxmlformats.org/markup-compatibility/2006" xmlns:r="http://schemas.openxmlformats.org/officeDocument/2006/relationships" xmlns:w="http://schemas.openxmlformats.org/wordprocessingml/2006/main" xmlns:w14="http://schemas.microsoft.com/office/word/2010/wordml" xmlns:w15="http://schemas.microsoft.com/office/word/2012/wordml" xmlns:w16="http://schemas.microsoft.com/office/word/2018/wordml" xmlns:w16cex="http://schemas.microsoft.com/office/word/2018/wordml/cex" xmlns:w16cid="http://schemas.microsoft.com/office/word/2016/wordml/cid" xmlns:w16se="http://schemas.microsoft.com/office/word/2015/wordml/symex" mc:Ignorable="w14 w15 w16se w16cid w16 w16cex">
+<w:styles xmlns:ns1="http://schemas.openxmlformats.org/markup-compatibility/2006" xmlns:w="http://schemas.openxmlformats.org/wordprocessingml/2006/main" ns1:Ignorable="w14 w15 w16se w16cid w16 w16cex">
   <w:docDefaults>
     <w:rPrDefault>
       <w:rPr>
         <w:rFonts w:asciiTheme="minorHAnsi" w:cstheme="minorBidi" w:eastAsiaTheme="minorEastAsia" w:hAnsiTheme="minorHAnsi"/>
         <w:sz w:val="24"/>
         <w:szCs w:val="24"/>
-        <w:lang w:bidi="ar-SA" w:eastAsia="en-US" w:val="en-AU"/>
+        <w:lang w:bidi="ar-SA" w:eastAsia="zh-CN" w:val="en-AU"/>
       </w:rPr>
     </w:rPrDefault>
     <w:pPrDefault/>
@@ -50497,7 +50497,7 @@
       <w:bCs/>
       <w:sz w:val="28"/>
       <w:szCs w:val="28"/>
-      <w:lang w:val="en-US"/>
+      <w:lang w:val="en-US" w:eastAsia="zh-CN"/>
     </w:rPr>
   </w:style>
   <w:style w:styleId="TOC1" w:type="paragraph">
@@ -51622,8 +51622,8 @@
       <w:spacing w:after="100" w:afterAutospacing="1" w:before="100" w:beforeAutospacing="1" w:line="240" w:lineRule="auto"/>
     </w:pPr>
     <w:rPr>
-      <w:rFonts w:ascii="Times New Roman" w:cs="Times New Roman" w:eastAsia="Times New Roman" w:hAnsi="Times New Roman"/>
-      <w:lang w:val="en-US"/>
+      <w:rFonts w:ascii="Times New Roman" w:cs="Times New Roman" w:hAnsi="Times New Roman" w:eastAsiaTheme="minorEastAsia"/>
+      <w:lang w:val="en-US" w:eastAsia="zh-CN"/>
     </w:rPr>
   </w:style>
   <w:style w:customStyle="1" w:styleId="apple-tab-span" w:type="character">

</xml_diff>

<commit_message>
fix(docx): preserve Office XML and update footer
</commit_message>
<xml_diff>
--- a/5.0/docs_zh-cn/OWASP_Application_Security_Verification_Standard_5.0.0_zh-cn.docx
+++ b/5.0/docs_zh-cn/OWASP_Application_Security_Verification_Standard_5.0.0_zh-cn.docx
@@ -44995,7 +44995,7 @@
                 <w:rPr>
                   <w:szCs w:val="20"/>
                 </w:rPr>
-                <w:t>OWASP Application Security Verification Standard 4.0</w:t>
+                <w:t>OWASP Application Security Verification Standard 5.0.0</w:t>
               </w:r>
             </w:p>
           </w:tc>
@@ -45056,7 +45056,7 @@
                 <w:rPr>
                   <w:szCs w:val="20"/>
                 </w:rPr>
-                <w:t>OWASP Application Security Verification Standard 4.0</w:t>
+                <w:t>OWASP Application Security Verification Standard 5.0.0</w:t>
               </w:r>
             </w:p>
           </w:tc>
@@ -49936,7 +49936,7 @@
 </file>
 
 <file path=word/styles.xml><?xml version="1.0" encoding="utf-8"?>
-<w:styles xmlns:ns1="http://schemas.openxmlformats.org/markup-compatibility/2006" xmlns:w="http://schemas.openxmlformats.org/wordprocessingml/2006/main" ns1:Ignorable="w14 w15 w16se w16cid w16 w16cex">
+<w:styles xmlns:mc="http://schemas.openxmlformats.org/markup-compatibility/2006" xmlns:r="http://schemas.openxmlformats.org/officeDocument/2006/relationships" xmlns:w="http://schemas.openxmlformats.org/wordprocessingml/2006/main" xmlns:w14="http://schemas.microsoft.com/office/word/2010/wordml" xmlns:w15="http://schemas.microsoft.com/office/word/2012/wordml" xmlns:w16="http://schemas.microsoft.com/office/word/2018/wordml" xmlns:w16cex="http://schemas.microsoft.com/office/word/2018/wordml/cex" xmlns:w16cid="http://schemas.microsoft.com/office/word/2016/wordml/cid" xmlns:w16se="http://schemas.microsoft.com/office/word/2015/wordml/symex" mc:Ignorable="w14 w15 w16se w16cid w16 w16cex">
   <w:docDefaults>
     <w:rPrDefault>
       <w:rPr>

</xml_diff>